<commit_message>
GBM: cover letters reflect the unified 4ZAU docking numbers
The submission-package cover letters now cite the single reproducible 4ZAU
docking run (33 dockable compounds, -3.8 to -9.2 kcal/mol, mean -7.1) and the
docking Q2_CV = 0.31 ("at best weakly predictive"), matching the manuscript.
Date bumped to 2026-09-09.

Co-Authored-By: Claude Sonnet 5 <noreply@anthropic.com>
</commit_message>
<xml_diff>
--- a/manuscript/submission_ready/01_Cover_Letter_Beilstein_GBM.docx
+++ b/manuscript/submission_ready/01_Cover_Letter_Beilstein_GBM.docx
@@ -18,7 +18,7 @@
         <w:br/>
         <w:t>Email: andres.monreal@ues.mx | ORCID: 0009-0009-1207-8597</w:t>
         <w:br/>
-        <w:t>Date: August 30, 2026</w:t>
+        <w:t>Date: September 9, 2026</w:t>
         <w:br/>
       </w:r>
     </w:p>
@@ -76,7 +76,7 @@
     </w:p>
     <w:p>
       <w:r>
-        <w:t>The study integrates GFN2-xTB quantum-chemical single-point interaction energies of 35 glioblastoma therapeutics on a pristine oxygen-terminated Ti3C2O2 MXene cluster, physical AutoDock Vina docking against the human EGFR kinase domain (PDB ID: 4ZAU, with 2J6M as a secondary control), and an explainable leak-free cross-validated surrogate model. The Ti3C2-Angiopep-2 functionalized system is discussed as future work because no real structural or quantum data for it exist; every figure and table reports values computed from the deposited pipeline, with no empirical-formula estimates.</w:t>
+        <w:t>The study integrates GFN2-xTB quantum-chemical single-point interaction energies of 35 glioblastoma therapeutics on a pristine oxygen-terminated Ti3C2O2 MXene cluster (Delta_E_int,SP = -0.9 to -15.5 kcal/mol), a single reproducible AutoDock Vina docking run of the 33 dockable compounds against the human EGFR kinase domain (PDB ID: 4ZAU, with 2J6M as a secondary control; scores -3.8 to -9.2 kcal/mol, mean -7.1), and an explainable leak-free nested cross-validated surrogate model. Descriptor-based prediction is at best weakly predictive (Q2_CV = 0.31 for the EGFR docking score, 0.10 for the MXene interaction energy), so the feature-importance analysis is presented as exploratory. The Ti3C2-Angiopep-2 functionalized system is discussed as future work because no real structural or quantum data for it exist; every figure and table reports values computed from the deposited pipeline, with no empirical-formula estimates.</w:t>
       </w:r>
     </w:p>
     <w:p>

</xml_diff>